<commit_message>
Fix pejabat signature block tags and layout across all master docx templates and server APIs
</commit_message>
<xml_diff>
--- a/frontend/templates/SRIKANDI - SURAT IZIN KERAMAIAN.docx
+++ b/frontend/templates/SRIKANDI - SURAT IZIN KERAMAIAN.docx
@@ -211,35 +211,50 @@
     </w:p>
     <w:p>
       <w:pPr>
+        <w:spacing w:line="360" w:lineRule="auto"/>
+        <w:rPr>
+          <w:rFonts w:ascii="Times New Roman" w:cs="Times New Roman" w:eastAsia="Times New Roman" w:hAnsi="Times New Roman"/>
+          <w:sz w:val="24"/>
+          <w:szCs w:val="24"/>
+        </w:rPr>
+      </w:pPr>
+      <w:r>
+        <w:rPr>
+          <w:rFonts w:ascii="Times New Roman" w:cs="Times New Roman" w:eastAsia="Times New Roman" w:hAnsi="Times New Roman"/>
+          <w:sz w:val="24"/>
+          <w:szCs w:val="24"/>
+        </w:rPr>
+        <w:t xml:space="preserve">Yang bertanda tangan di bawah ini :</w:t>
+      </w:r>
+    </w:p>
+    <w:p>
+      <w:pPr>
         <w:tabs>
           <w:tab w:val="left" w:leader="none" w:pos="851"/>
-          <w:tab w:val="left" w:leader="none" w:pos="3686"/>
-          <w:tab w:val="left" w:leader="none" w:pos="4111"/>
+          <w:tab w:val="left" w:leader="none" w:pos="3119"/>
+          <w:tab w:val="left" w:leader="none" w:pos="3402"/>
         </w:tabs>
         <w:spacing w:line="360" w:lineRule="auto"/>
+        <w:ind w:left="851" w:firstLine="0"/>
         <w:jc w:val="both"/>
         <w:rPr>
-          <w:rFonts w:ascii="Tahoma" w:cs="Tahoma" w:eastAsia="Tahoma" w:hAnsi="Tahoma"/>
-        </w:rPr>
-      </w:pPr>
-      <w:r>
-        <w:rPr>
-          <w:rFonts w:ascii="Tahoma" w:cs="Tahoma" w:eastAsia="Tahoma" w:hAnsi="Tahoma"/>
-          <w:rtl w:val="0"/>
-        </w:rPr>
-        <w:t xml:space="preserve">Yang bertanda tangan di bawah ini </w:t>
+          <w:rFonts w:ascii="Times New Roman" w:cs="Times New Roman" w:eastAsia="Times New Roman" w:hAnsi="Times New Roman"/>
+          <w:sz w:val="24"/>
+          <w:szCs w:val="24"/>
+        </w:rPr>
+      </w:pPr>
+      <w:r>
+        <w:rPr>
+          <w:rFonts w:ascii="Times New Roman" w:cs="Times New Roman" w:eastAsia="Times New Roman" w:hAnsi="Times New Roman"/>
+          <w:sz w:val="24"/>
+          <w:szCs w:val="24"/>
+        </w:rPr>
+        <w:t xml:space="preserve">Nama</w:t>
         <w:tab/>
         <w:t xml:space="preserve">:</w:t>
-      </w:r>
-    </w:p>
-    <w:p>
-      <w:pPr>
-        <w:tabs>
-          <w:tab w:val="left" w:leader="none" w:pos="1080"/>
-          <w:tab w:val="left" w:leader="none" w:pos="3150"/>
-          <w:tab w:val="left" w:leader="none" w:pos="3420"/>
-        </w:tabs>
-        <w:spacing w:after="200" w:line="240" w:lineRule="auto"/>
+        <w:tab/>
+      </w:r>
+      <w:r>
         <w:rPr>
           <w:rFonts w:ascii="Times New Roman" w:cs="Times New Roman" w:eastAsia="Times New Roman" w:hAnsi="Times New Roman"/>
           <w:b w:val="1"/>
@@ -247,18 +262,34 @@
           <w:sz w:val="24"/>
           <w:szCs w:val="24"/>
         </w:rPr>
-      </w:pPr>
-      <w:r>
+        <w:t xml:space="preserve">&lt;&lt;pejabat_ttd&gt;&gt;</w:t>
+      </w:r>
+    </w:p>
+    <w:p>
+      <w:pPr>
+        <w:tabs>
+          <w:tab w:val="left" w:leader="none" w:pos="851"/>
+          <w:tab w:val="left" w:leader="none" w:pos="3119"/>
+          <w:tab w:val="left" w:leader="none" w:pos="3402"/>
+        </w:tabs>
+        <w:spacing w:line="360" w:lineRule="auto"/>
+        <w:ind w:left="851" w:firstLine="0"/>
+        <w:jc w:val="both"/>
         <w:rPr>
           <w:rFonts w:ascii="Times New Roman" w:cs="Times New Roman" w:eastAsia="Times New Roman" w:hAnsi="Times New Roman"/>
           <w:sz w:val="24"/>
           <w:szCs w:val="24"/>
-          <w:rtl w:val="0"/>
-        </w:rPr>
-        <w:tab/>
-        <w:t xml:space="preserve">Nama</w:t>
-        <w:tab/>
-        <w:t xml:space="preserve">: </w:t>
+        </w:rPr>
+      </w:pPr>
+      <w:r>
+        <w:rPr>
+          <w:rFonts w:ascii="Times New Roman" w:cs="Times New Roman" w:eastAsia="Times New Roman" w:hAnsi="Times New Roman"/>
+          <w:sz w:val="24"/>
+          <w:szCs w:val="24"/>
+        </w:rPr>
+        <w:t xml:space="preserve">Jabatan</w:t>
+        <w:tab/>
+        <w:t xml:space="preserve">:</w:t>
         <w:tab/>
       </w:r>
       <w:r>
@@ -268,19 +299,20 @@
           <w:bCs w:val="1"/>
           <w:sz w:val="24"/>
           <w:szCs w:val="24"/>
-          <w:rtl w:val="0"/>
-        </w:rPr>
-        <w:t xml:space="preserve">&lt;&lt;Pejabat yang Bertanda Tangan&gt;&gt;</w:t>
+        </w:rPr>
+        <w:t xml:space="preserve">&lt;&lt;jabatan_pejabat&gt;&gt;</w:t>
       </w:r>
     </w:p>
     <w:p>
       <w:pPr>
         <w:tabs>
-          <w:tab w:val="left" w:leader="none" w:pos="1080"/>
-          <w:tab w:val="left" w:leader="none" w:pos="3150"/>
-          <w:tab w:val="left" w:leader="none" w:pos="3420"/>
+          <w:tab w:val="left" w:leader="none" w:pos="851"/>
+          <w:tab w:val="left" w:leader="none" w:pos="3119"/>
+          <w:tab w:val="left" w:leader="none" w:pos="3402"/>
         </w:tabs>
-        <w:spacing w:after="200" w:line="240" w:lineRule="auto"/>
+        <w:spacing w:line="360" w:lineRule="auto"/>
+        <w:ind w:left="851" w:firstLine="0"/>
+        <w:jc w:val="both"/>
         <w:rPr>
           <w:rFonts w:ascii="Times New Roman" w:cs="Times New Roman" w:eastAsia="Times New Roman" w:hAnsi="Times New Roman"/>
           <w:sz w:val="24"/>
@@ -292,24 +324,25 @@
           <w:rFonts w:ascii="Times New Roman" w:cs="Times New Roman" w:eastAsia="Times New Roman" w:hAnsi="Times New Roman"/>
           <w:sz w:val="24"/>
           <w:szCs w:val="24"/>
-          <w:rtl w:val="0"/>
-        </w:rPr>
-        <w:tab/>
-        <w:t xml:space="preserve">Jabatan </w:t>
-        <w:tab/>
-        <w:t xml:space="preserve">: </w:t>
-        <w:tab/>
-        <w:t xml:space="preserve">&lt;&lt;Jabatan Pejabat yang Bertanda Tangan&gt;&gt;</w:t>
-      </w:r>
-    </w:p>
-    <w:p>
-      <w:pPr>
-        <w:tabs>
-          <w:tab w:val="left" w:leader="none" w:pos="1080"/>
-          <w:tab w:val="left" w:leader="none" w:pos="3150"/>
-          <w:tab w:val="left" w:leader="none" w:pos="3420"/>
-        </w:tabs>
-        <w:spacing w:after="200" w:line="240" w:lineRule="auto"/>
+        </w:rPr>
+        <w:t xml:space="preserve">Nip</w:t>
+        <w:tab/>
+        <w:t xml:space="preserve">:</w:t>
+        <w:tab/>
+      </w:r>
+      <w:r>
+        <w:rPr>
+          <w:rFonts w:ascii="Times New Roman" w:cs="Times New Roman" w:eastAsia="Times New Roman" w:hAnsi="Times New Roman"/>
+          <w:b w:val="1"/>
+          <w:bCs w:val="1"/>
+          <w:sz w:val="24"/>
+          <w:szCs w:val="24"/>
+        </w:rPr>
+        <w:t xml:space="preserve">&lt;&lt;nip_pejabat&gt;&gt;</w:t>
+      </w:r>
+    </w:p>
+    <w:p>
+      <w:pPr>
         <w:rPr>
           <w:rFonts w:ascii="Times New Roman" w:cs="Times New Roman" w:eastAsia="Times New Roman" w:hAnsi="Times New Roman"/>
           <w:sz w:val="24"/>
@@ -321,39 +354,6 @@
           <w:rFonts w:ascii="Times New Roman" w:cs="Times New Roman" w:eastAsia="Times New Roman" w:hAnsi="Times New Roman"/>
           <w:sz w:val="24"/>
           <w:szCs w:val="24"/>
-          <w:rtl w:val="0"/>
-        </w:rPr>
-        <w:tab/>
-        <w:t xml:space="preserve">Nip </w:t>
-        <w:tab/>
-        <w:t xml:space="preserve">:</w:t>
-        <w:tab/>
-        <w:t xml:space="preserve">&lt;&lt;NIP Pejabat yang Bertanda Tangan&gt;&gt;</w:t>
-      </w:r>
-    </w:p>
-    <w:p>
-      <w:pPr>
-        <w:tabs>
-          <w:tab w:val="left" w:leader="none" w:pos="851"/>
-          <w:tab w:val="left" w:leader="none" w:pos="3686"/>
-          <w:tab w:val="left" w:leader="none" w:pos="3969"/>
-          <w:tab w:val="left" w:leader="none" w:pos="4111"/>
-          <w:tab w:val="left" w:leader="none" w:pos="4253"/>
-        </w:tabs>
-        <w:spacing w:line="360" w:lineRule="auto"/>
-        <w:jc w:val="both"/>
-        <w:rPr>
-          <w:rFonts w:ascii="Tahoma" w:cs="Tahoma" w:eastAsia="Tahoma" w:hAnsi="Tahoma"/>
-          <w:b w:val="1"/>
-          <w:bCs w:val="1"/>
-          <w:sz w:val="16"/>
-          <w:szCs w:val="16"/>
-        </w:rPr>
-      </w:pPr>
-      <w:r>
-        <w:rPr>
-          <w:rFonts w:ascii="Tahoma" w:cs="Tahoma" w:eastAsia="Tahoma" w:hAnsi="Tahoma"/>
-          <w:rtl w:val="0"/>
         </w:rPr>
         <w:t xml:space="preserve">Menerangkan bahwa :</w:t>
       </w:r>

</xml_diff>